<commit_message>
Agregando cosas a la documentación
</commit_message>
<xml_diff>
--- a/Proyecto_LCS.docx
+++ b/Proyecto_LCS.docx
@@ -47,7 +47,7 @@
                     </pic:cNvPicPr>
                   </pic:nvPicPr>
                   <pic:blipFill>
-                    <a:blip r:embed="rId4">
+                    <a:blip r:embed="rId6">
                       <a:extLst>
                         <a:ext uri="{28A0092B-C50C-407E-A947-70E740481C1C}">
                           <a14:useLocalDpi xmlns:a14="http://schemas.microsoft.com/office/drawing/2010/main" val="0"/>
@@ -401,23 +401,7 @@
         <w:t>El</w:t>
       </w:r>
       <w:r>
-        <w:t xml:space="preserve"> solicitante del sistema serian los dueños de la barbería </w:t>
-      </w:r>
-      <w:proofErr w:type="gramStart"/>
-      <w:r>
-        <w:t>y  los</w:t>
-      </w:r>
-      <w:proofErr w:type="gramEnd"/>
-      <w:r>
-        <w:t xml:space="preserve"> usuario final serian los barberos y los destinatarios </w:t>
-      </w:r>
-      <w:proofErr w:type="gramStart"/>
-      <w:r>
-        <w:t>final  serian</w:t>
-      </w:r>
-      <w:proofErr w:type="gramEnd"/>
-      <w:r>
-        <w:t xml:space="preserve"> los clientes.</w:t>
+        <w:t xml:space="preserve"> solicitante del sistema serian los dueños de la barbería y  los usuario final serian los barberos y los destinatarios final  serian los clientes.</w:t>
       </w:r>
     </w:p>
     <w:p>
@@ -558,6 +542,7 @@
           <w:b/>
           <w:bCs/>
         </w:rPr>
+        <w:lastRenderedPageBreak/>
         <w:t>Implementar un panel de administración</w:t>
       </w:r>
       <w:r>
@@ -571,7 +556,6 @@
           <w:b/>
           <w:bCs/>
         </w:rPr>
-        <w:lastRenderedPageBreak/>
         <w:t>Almacenar y gestionar datos de forma segura</w:t>
       </w:r>
       <w:r>
@@ -728,6 +712,7 @@
     </w:p>
     <w:p>
       <w:r>
+        <w:lastRenderedPageBreak/>
         <w:t>-Protección de datos de clientes.</w:t>
       </w:r>
     </w:p>
@@ -745,220 +730,301 @@
           <w:b/>
           <w:bCs/>
         </w:rPr>
+        <w:t>Datos que va a manejar la web</w:t>
+      </w:r>
+      <w:r>
+        <w:rPr>
+          <w:b/>
+          <w:bCs/>
+        </w:rPr>
+        <w:t>:</w:t>
+      </w:r>
+    </w:p>
+    <w:p>
+      <w:r>
+        <w:t xml:space="preserve">Clientes: nombre, </w:t>
+      </w:r>
+      <w:proofErr w:type="spellStart"/>
+      <w:r>
+        <w:t>dni_cliente</w:t>
+      </w:r>
+      <w:proofErr w:type="spellEnd"/>
+      <w:r>
+        <w:t>, teléfono, email.</w:t>
+      </w:r>
+    </w:p>
+    <w:p>
+      <w:r>
+        <w:t>Empleados: nombre</w:t>
+      </w:r>
+      <w:r>
+        <w:t xml:space="preserve">, </w:t>
+      </w:r>
+      <w:proofErr w:type="spellStart"/>
+      <w:r>
+        <w:t>dni_cliente</w:t>
+      </w:r>
+      <w:proofErr w:type="spellEnd"/>
+      <w:r>
+        <w:t>, especialidad, horarios.</w:t>
+      </w:r>
+    </w:p>
+    <w:p>
+      <w:r>
+        <w:t xml:space="preserve">Turnos: </w:t>
+      </w:r>
+      <w:proofErr w:type="spellStart"/>
+      <w:r>
+        <w:t>id_turno</w:t>
+      </w:r>
+      <w:proofErr w:type="spellEnd"/>
+      <w:r>
+        <w:t xml:space="preserve">, </w:t>
+      </w:r>
+      <w:r>
+        <w:t>fecha, hora, cliente, empleado, servicio.</w:t>
+      </w:r>
+    </w:p>
+    <w:p>
+      <w:r>
+        <w:t xml:space="preserve">Productos: </w:t>
+      </w:r>
+      <w:proofErr w:type="spellStart"/>
+      <w:r>
+        <w:t>id_producto</w:t>
+      </w:r>
+      <w:proofErr w:type="spellEnd"/>
+      <w:r>
+        <w:t xml:space="preserve">, </w:t>
+      </w:r>
+      <w:r>
+        <w:t>nombre, precio, stock.</w:t>
+      </w:r>
+    </w:p>
+    <w:p>
+      <w:r>
+        <w:t xml:space="preserve">Ventas: </w:t>
+      </w:r>
+      <w:proofErr w:type="spellStart"/>
+      <w:r>
+        <w:t>id_venta</w:t>
+      </w:r>
+      <w:proofErr w:type="spellEnd"/>
+      <w:r>
+        <w:t xml:space="preserve">, </w:t>
+      </w:r>
+      <w:r>
+        <w:t>producto, cantidad, fecha, total.</w:t>
+      </w:r>
+    </w:p>
+    <w:p>
+      <w:proofErr w:type="spellStart"/>
+      <w:r>
+        <w:t>Detalles</w:t>
+      </w:r>
+      <w:r>
+        <w:t>_</w:t>
+      </w:r>
+      <w:r>
+        <w:t>venta</w:t>
+      </w:r>
+      <w:proofErr w:type="spellEnd"/>
+      <w:r>
+        <w:t xml:space="preserve">: </w:t>
+      </w:r>
+      <w:proofErr w:type="spellStart"/>
+      <w:r>
+        <w:t>id_detalle</w:t>
+      </w:r>
+      <w:proofErr w:type="spellEnd"/>
+      <w:r>
+        <w:t xml:space="preserve">, cantidad, </w:t>
+      </w:r>
+      <w:proofErr w:type="spellStart"/>
+      <w:r>
+        <w:t>precio_unitario</w:t>
+      </w:r>
+      <w:proofErr w:type="spellEnd"/>
+    </w:p>
+    <w:p>
+      <w:pPr>
+        <w:rPr>
+          <w:b/>
+          <w:bCs/>
+        </w:rPr>
+      </w:pPr>
+      <w:r>
+        <w:rPr>
+          <w:b/>
+          <w:bCs/>
+        </w:rPr>
+        <w:t>Entradas, procesos y salidas</w:t>
+      </w:r>
+      <w:r>
+        <w:rPr>
+          <w:b/>
+          <w:bCs/>
+        </w:rPr>
+        <w:t>:</w:t>
+      </w:r>
+    </w:p>
+    <w:p>
+      <w:pPr>
+        <w:rPr>
+          <w:b/>
+          <w:bCs/>
+          <w:color w:val="215E99" w:themeColor="text2" w:themeTint="BF"/>
+        </w:rPr>
+      </w:pPr>
+      <w:r>
+        <w:rPr>
+          <w:b/>
+          <w:bCs/>
+          <w:color w:val="215E99" w:themeColor="text2" w:themeTint="BF"/>
+        </w:rPr>
+        <w:t>Entradas</w:t>
+      </w:r>
+    </w:p>
+    <w:p>
+      <w:r>
+        <w:t>-Datos de clientes</w:t>
+      </w:r>
+    </w:p>
+    <w:p>
+      <w:r>
+        <w:t>-Datos de turnos</w:t>
+      </w:r>
+    </w:p>
+    <w:p>
+      <w:r>
+        <w:t>-Datos de productos</w:t>
+      </w:r>
+    </w:p>
+    <w:p>
+      <w:r>
+        <w:t>-Datos de empleados</w:t>
+      </w:r>
+    </w:p>
+    <w:p>
+      <w:pPr>
+        <w:rPr>
+          <w:b/>
+          <w:bCs/>
+          <w:color w:val="215E99" w:themeColor="text2" w:themeTint="BF"/>
+        </w:rPr>
+      </w:pPr>
+      <w:r>
+        <w:rPr>
+          <w:b/>
+          <w:bCs/>
+          <w:color w:val="215E99" w:themeColor="text2" w:themeTint="BF"/>
+        </w:rPr>
+        <w:t>Procesos</w:t>
+      </w:r>
+    </w:p>
+    <w:p>
+      <w:r>
+        <w:t>-Validación de datos</w:t>
+      </w:r>
+    </w:p>
+    <w:p>
+      <w:r>
+        <w:t>-Asignación de turnos</w:t>
+      </w:r>
+    </w:p>
+    <w:p>
+      <w:r>
+        <w:t>-Cálculo de ventas</w:t>
+      </w:r>
+    </w:p>
+    <w:p>
+      <w:r>
+        <w:t>-Actualización de stock</w:t>
+      </w:r>
+    </w:p>
+    <w:p>
+      <w:pPr>
+        <w:rPr>
+          <w:b/>
+          <w:bCs/>
+          <w:color w:val="215E99" w:themeColor="text2" w:themeTint="BF"/>
+        </w:rPr>
+      </w:pPr>
+      <w:r>
+        <w:rPr>
+          <w:b/>
+          <w:bCs/>
+          <w:color w:val="215E99" w:themeColor="text2" w:themeTint="BF"/>
+        </w:rPr>
+        <w:t>Salidas</w:t>
+      </w:r>
+      <w:r>
+        <w:rPr>
+          <w:b/>
+          <w:bCs/>
+          <w:color w:val="215E99" w:themeColor="text2" w:themeTint="BF"/>
+        </w:rPr>
+        <w:t>:</w:t>
+      </w:r>
+    </w:p>
+    <w:p>
+      <w:r>
+        <w:t>-Lista de turnos</w:t>
+      </w:r>
+    </w:p>
+    <w:p>
+      <w:r>
+        <w:t>-Reportes de ventas</w:t>
+      </w:r>
+    </w:p>
+    <w:p>
+      <w:r>
+        <w:t>-Disponibilidad de horarios</w:t>
+      </w:r>
+    </w:p>
+    <w:p>
+      <w:r>
+        <w:t>-Información de clientes</w:t>
+      </w:r>
+    </w:p>
+    <w:p>
+      <w:pPr>
+        <w:rPr>
+          <w:b/>
+          <w:bCs/>
+        </w:rPr>
+      </w:pPr>
+      <w:r>
+        <w:t xml:space="preserve"> </w:t>
+      </w:r>
+      <w:r>
+        <w:rPr>
+          <w:b/>
+          <w:bCs/>
+        </w:rPr>
+        <w:t>Alcance y límites del sistema</w:t>
+      </w:r>
+    </w:p>
+    <w:p>
+      <w:pPr>
+        <w:rPr>
+          <w:b/>
+          <w:bCs/>
+          <w:color w:val="0C3512" w:themeColor="accent3" w:themeShade="80"/>
+        </w:rPr>
+      </w:pPr>
+      <w:r>
+        <w:rPr>
+          <w:b/>
+          <w:bCs/>
+          <w:color w:val="0C3512" w:themeColor="accent3" w:themeShade="80"/>
+        </w:rPr>
+        <w:t>Alcance:</w:t>
+      </w:r>
+    </w:p>
+    <w:p>
+      <w:r>
         <w:lastRenderedPageBreak/>
-        <w:t>Datos que va a manejar la web</w:t>
-      </w:r>
-      <w:r>
-        <w:rPr>
-          <w:b/>
-          <w:bCs/>
-        </w:rPr>
-        <w:t>:</w:t>
-      </w:r>
-    </w:p>
-    <w:p>
-      <w:r>
-        <w:t>Clientes: nombre, DNI, teléfono, email.</w:t>
-      </w:r>
-    </w:p>
-    <w:p>
-      <w:r>
-        <w:t>Empleados: nombre DNI, especialidad, horarios.</w:t>
-      </w:r>
-    </w:p>
-    <w:p>
-      <w:r>
-        <w:t>Turnos: fecha, hora, cliente, empleado, servicio.</w:t>
-      </w:r>
-    </w:p>
-    <w:p>
-      <w:r>
-        <w:t>Productos: nombre, precio, stock.</w:t>
-      </w:r>
-    </w:p>
-    <w:p>
-      <w:r>
-        <w:t>Ventas: producto, cantidad, fecha, total.</w:t>
-      </w:r>
-    </w:p>
-    <w:p>
-      <w:pPr>
-        <w:rPr>
-          <w:b/>
-          <w:bCs/>
-        </w:rPr>
-      </w:pPr>
-      <w:r>
-        <w:rPr>
-          <w:b/>
-          <w:bCs/>
-        </w:rPr>
-        <w:t>Entradas, procesos y salidas</w:t>
-      </w:r>
-      <w:r>
-        <w:rPr>
-          <w:b/>
-          <w:bCs/>
-        </w:rPr>
-        <w:t>:</w:t>
-      </w:r>
-    </w:p>
-    <w:p>
-      <w:pPr>
-        <w:rPr>
-          <w:b/>
-          <w:bCs/>
-          <w:color w:val="215E99" w:themeColor="text2" w:themeTint="BF"/>
-        </w:rPr>
-      </w:pPr>
-      <w:r>
-        <w:rPr>
-          <w:b/>
-          <w:bCs/>
-          <w:color w:val="215E99" w:themeColor="text2" w:themeTint="BF"/>
-        </w:rPr>
-        <w:t>Entradas</w:t>
-      </w:r>
-    </w:p>
-    <w:p>
-      <w:r>
-        <w:t>-Datos de clientes</w:t>
-      </w:r>
-    </w:p>
-    <w:p>
-      <w:r>
-        <w:t>-Datos de turnos</w:t>
-      </w:r>
-    </w:p>
-    <w:p>
-      <w:r>
-        <w:t>-Datos de productos</w:t>
-      </w:r>
-    </w:p>
-    <w:p>
-      <w:r>
-        <w:t>-Datos de empleados</w:t>
-      </w:r>
-    </w:p>
-    <w:p>
-      <w:pPr>
-        <w:rPr>
-          <w:b/>
-          <w:bCs/>
-          <w:color w:val="215E99" w:themeColor="text2" w:themeTint="BF"/>
-        </w:rPr>
-      </w:pPr>
-      <w:r>
-        <w:rPr>
-          <w:b/>
-          <w:bCs/>
-          <w:color w:val="215E99" w:themeColor="text2" w:themeTint="BF"/>
-        </w:rPr>
-        <w:t>Procesos</w:t>
-      </w:r>
-    </w:p>
-    <w:p>
-      <w:r>
-        <w:t>-Validación de datos</w:t>
-      </w:r>
-    </w:p>
-    <w:p>
-      <w:r>
-        <w:t>-Asignación de turnos</w:t>
-      </w:r>
-    </w:p>
-    <w:p>
-      <w:r>
-        <w:t>-Cálculo de ventas</w:t>
-      </w:r>
-    </w:p>
-    <w:p>
-      <w:r>
-        <w:t>-Actualización de stock</w:t>
-      </w:r>
-    </w:p>
-    <w:p>
-      <w:pPr>
-        <w:rPr>
-          <w:b/>
-          <w:bCs/>
-          <w:color w:val="215E99" w:themeColor="text2" w:themeTint="BF"/>
-        </w:rPr>
-      </w:pPr>
-      <w:r>
-        <w:rPr>
-          <w:b/>
-          <w:bCs/>
-          <w:color w:val="215E99" w:themeColor="text2" w:themeTint="BF"/>
-        </w:rPr>
-        <w:t>Salidas</w:t>
-      </w:r>
-      <w:r>
-        <w:rPr>
-          <w:b/>
-          <w:bCs/>
-          <w:color w:val="215E99" w:themeColor="text2" w:themeTint="BF"/>
-        </w:rPr>
-        <w:t>:</w:t>
-      </w:r>
-    </w:p>
-    <w:p>
-      <w:r>
-        <w:t>-Lista de turnos</w:t>
-      </w:r>
-    </w:p>
-    <w:p>
-      <w:r>
-        <w:t>-Reportes de ventas</w:t>
-      </w:r>
-    </w:p>
-    <w:p>
-      <w:r>
-        <w:t>-Disponibilidad de horarios</w:t>
-      </w:r>
-    </w:p>
-    <w:p>
-      <w:r>
-        <w:t>-Información de clientes</w:t>
-      </w:r>
-    </w:p>
-    <w:p>
-      <w:pPr>
-        <w:rPr>
-          <w:b/>
-          <w:bCs/>
-        </w:rPr>
-      </w:pPr>
-      <w:r>
-        <w:t xml:space="preserve"> </w:t>
-      </w:r>
-      <w:r>
-        <w:rPr>
-          <w:b/>
-          <w:bCs/>
-        </w:rPr>
-        <w:t>Alcance y límites del sistema</w:t>
-      </w:r>
-    </w:p>
-    <w:p>
-      <w:pPr>
-        <w:rPr>
-          <w:b/>
-          <w:bCs/>
-          <w:color w:val="0C3512" w:themeColor="accent3" w:themeShade="80"/>
-        </w:rPr>
-      </w:pPr>
-      <w:r>
-        <w:rPr>
-          <w:b/>
-          <w:bCs/>
-          <w:color w:val="0C3512" w:themeColor="accent3" w:themeShade="80"/>
-        </w:rPr>
-        <w:t>Alcance:</w:t>
-      </w:r>
-    </w:p>
-    <w:p>
-      <w:r>
         <w:t>-Gestión completa de turnos</w:t>
       </w:r>
     </w:p>
@@ -1071,6 +1137,78 @@
           <w:rFonts w:ascii="Bahnschrift SemiBold Condensed" w:hAnsi="Bahnschrift SemiBold Condensed"/>
           <w:b/>
           <w:bCs/>
+          <w:sz w:val="56"/>
+          <w:szCs w:val="56"/>
+        </w:rPr>
+      </w:pPr>
+    </w:p>
+    <w:p>
+      <w:pPr>
+        <w:jc w:val="center"/>
+        <w:rPr>
+          <w:rFonts w:ascii="Bahnschrift SemiBold Condensed" w:hAnsi="Bahnschrift SemiBold Condensed"/>
+          <w:b/>
+          <w:bCs/>
+          <w:sz w:val="56"/>
+          <w:szCs w:val="56"/>
+        </w:rPr>
+      </w:pPr>
+    </w:p>
+    <w:p>
+      <w:pPr>
+        <w:jc w:val="center"/>
+        <w:rPr>
+          <w:rFonts w:ascii="Bahnschrift SemiBold Condensed" w:hAnsi="Bahnschrift SemiBold Condensed"/>
+          <w:b/>
+          <w:bCs/>
+          <w:sz w:val="56"/>
+          <w:szCs w:val="56"/>
+        </w:rPr>
+      </w:pPr>
+    </w:p>
+    <w:p>
+      <w:pPr>
+        <w:jc w:val="center"/>
+        <w:rPr>
+          <w:rFonts w:ascii="Bahnschrift SemiBold Condensed" w:hAnsi="Bahnschrift SemiBold Condensed"/>
+          <w:b/>
+          <w:bCs/>
+          <w:sz w:val="56"/>
+          <w:szCs w:val="56"/>
+        </w:rPr>
+      </w:pPr>
+    </w:p>
+    <w:p>
+      <w:pPr>
+        <w:jc w:val="center"/>
+        <w:rPr>
+          <w:rFonts w:ascii="Bahnschrift SemiBold Condensed" w:hAnsi="Bahnschrift SemiBold Condensed"/>
+          <w:b/>
+          <w:bCs/>
+          <w:sz w:val="56"/>
+          <w:szCs w:val="56"/>
+        </w:rPr>
+      </w:pPr>
+    </w:p>
+    <w:p>
+      <w:pPr>
+        <w:jc w:val="center"/>
+        <w:rPr>
+          <w:rFonts w:ascii="Bahnschrift SemiBold Condensed" w:hAnsi="Bahnschrift SemiBold Condensed"/>
+          <w:b/>
+          <w:bCs/>
+          <w:sz w:val="56"/>
+          <w:szCs w:val="56"/>
+        </w:rPr>
+      </w:pPr>
+    </w:p>
+    <w:p>
+      <w:pPr>
+        <w:jc w:val="center"/>
+        <w:rPr>
+          <w:rFonts w:ascii="Bahnschrift SemiBold Condensed" w:hAnsi="Bahnschrift SemiBold Condensed"/>
+          <w:b/>
+          <w:bCs/>
           <w:sz w:val="52"/>
           <w:szCs w:val="52"/>
         </w:rPr>
@@ -1083,6 +1221,7 @@
           <w:sz w:val="56"/>
           <w:szCs w:val="56"/>
         </w:rPr>
+        <w:lastRenderedPageBreak/>
         <w:t>Arquitectura de la página web</w:t>
       </w:r>
     </w:p>
@@ -1101,9 +1240,9 @@
           <w:noProof/>
         </w:rPr>
         <w:drawing>
-          <wp:inline distT="0" distB="0" distL="0" distR="0" wp14:anchorId="76A39267" wp14:editId="7E1F7BF7">
-            <wp:extent cx="5400040" cy="3504565"/>
-            <wp:effectExtent l="0" t="0" r="0" b="635"/>
+          <wp:inline distT="0" distB="0" distL="0" distR="0" wp14:anchorId="76A39267" wp14:editId="3A119271">
+            <wp:extent cx="4524293" cy="2936215"/>
+            <wp:effectExtent l="0" t="0" r="0" b="0"/>
             <wp:docPr id="576636971" name="Imagen 1"/>
             <wp:cNvGraphicFramePr>
               <a:graphicFrameLocks xmlns:a="http://schemas.openxmlformats.org/drawingml/2006/main" noChangeAspect="1"/>
@@ -1118,7 +1257,7 @@
                     </pic:cNvPicPr>
                   </pic:nvPicPr>
                   <pic:blipFill>
-                    <a:blip r:embed="rId5">
+                    <a:blip r:embed="rId7">
                       <a:extLst>
                         <a:ext uri="{28A0092B-C50C-407E-A947-70E740481C1C}">
                           <a14:useLocalDpi xmlns:a14="http://schemas.microsoft.com/office/drawing/2010/main" val="0"/>
@@ -1133,7 +1272,7 @@
                   <pic:spPr bwMode="auto">
                     <a:xfrm>
                       <a:off x="0" y="0"/>
-                      <a:ext cx="5400040" cy="3504565"/>
+                      <a:ext cx="4530871" cy="2940484"/>
                     </a:xfrm>
                     <a:prstGeom prst="rect">
                       <a:avLst/>
@@ -1150,7 +1289,406 @@
         </w:drawing>
       </w:r>
     </w:p>
+    <w:p>
+      <w:pPr>
+        <w:jc w:val="center"/>
+        <w:rPr>
+          <w:rFonts w:ascii="Bahnschrift SemiBold Condensed" w:hAnsi="Bahnschrift SemiBold Condensed"/>
+          <w:b/>
+          <w:bCs/>
+          <w:sz w:val="52"/>
+          <w:szCs w:val="52"/>
+        </w:rPr>
+      </w:pPr>
+      <w:r>
+        <w:rPr>
+          <w:rFonts w:ascii="Bahnschrift SemiBold Condensed" w:hAnsi="Bahnschrift SemiBold Condensed"/>
+          <w:b/>
+          <w:bCs/>
+          <w:sz w:val="56"/>
+          <w:szCs w:val="56"/>
+        </w:rPr>
+        <w:t>MER del</w:t>
+      </w:r>
+      <w:r>
+        <w:rPr>
+          <w:rFonts w:ascii="Bahnschrift SemiBold Condensed" w:hAnsi="Bahnschrift SemiBold Condensed"/>
+          <w:b/>
+          <w:bCs/>
+          <w:sz w:val="56"/>
+          <w:szCs w:val="56"/>
+        </w:rPr>
+        <w:t xml:space="preserve"> de la página web</w:t>
+      </w:r>
+    </w:p>
+    <w:p>
+      <w:pPr>
+        <w:jc w:val="center"/>
+      </w:pPr>
+      <w:r>
+        <w:rPr>
+          <w:noProof/>
+        </w:rPr>
+        <mc:AlternateContent>
+          <mc:Choice Requires="wps">
+            <w:drawing>
+              <wp:inline distT="0" distB="0" distL="0" distR="0" wp14:anchorId="14FE53C6" wp14:editId="16363BCF">
+                <wp:extent cx="302260" cy="302260"/>
+                <wp:effectExtent l="0" t="0" r="0" b="0"/>
+                <wp:docPr id="2020885267" name="Rectángulo 1" descr="Diagrama ER de ventas y empleados"/>
+                <wp:cNvGraphicFramePr>
+                  <a:graphicFrameLocks xmlns:a="http://schemas.openxmlformats.org/drawingml/2006/main" noChangeAspect="1"/>
+                </wp:cNvGraphicFramePr>
+                <a:graphic xmlns:a="http://schemas.openxmlformats.org/drawingml/2006/main">
+                  <a:graphicData uri="http://schemas.microsoft.com/office/word/2010/wordprocessingShape">
+                    <wps:wsp>
+                      <wps:cNvSpPr>
+                        <a:spLocks noChangeAspect="1" noChangeArrowheads="1"/>
+                      </wps:cNvSpPr>
+                      <wps:spPr bwMode="auto">
+                        <a:xfrm>
+                          <a:off x="0" y="0"/>
+                          <a:ext cx="302260" cy="302260"/>
+                        </a:xfrm>
+                        <a:prstGeom prst="rect">
+                          <a:avLst/>
+                        </a:prstGeom>
+                        <a:noFill/>
+                        <a:ln>
+                          <a:noFill/>
+                        </a:ln>
+                        <a:extLst>
+                          <a:ext uri="{909E8E84-426E-40DD-AFC4-6F175D3DCCD1}">
+                            <a14:hiddenFill xmlns:a14="http://schemas.microsoft.com/office/drawing/2010/main">
+                              <a:solidFill>
+                                <a:srgbClr val="FFFFFF"/>
+                              </a:solidFill>
+                            </a14:hiddenFill>
+                          </a:ext>
+                          <a:ext uri="{91240B29-F687-4F45-9708-019B960494DF}">
+                            <a14:hiddenLine xmlns:a14="http://schemas.microsoft.com/office/drawing/2010/main" w="9525">
+                              <a:solidFill>
+                                <a:srgbClr val="000000"/>
+                              </a:solidFill>
+                              <a:miter lim="800000"/>
+                              <a:headEnd/>
+                              <a:tailEnd/>
+                            </a14:hiddenLine>
+                          </a:ext>
+                        </a:extLst>
+                      </wps:spPr>
+                      <wps:bodyPr rot="0" vert="horz" wrap="square" lIns="91440" tIns="45720" rIns="91440" bIns="45720" anchor="t" anchorCtr="0" upright="1">
+                        <a:noAutofit/>
+                      </wps:bodyPr>
+                    </wps:wsp>
+                  </a:graphicData>
+                </a:graphic>
+              </wp:inline>
+            </w:drawing>
+          </mc:Choice>
+          <mc:Fallback>
+            <w:pict>
+              <v:rect w14:anchorId="4DB0227F" id="Rectángulo 1" o:spid="_x0000_s1026" alt="Diagrama ER de ventas y empleados" style="width:23.8pt;height:23.8pt;visibility:visible;mso-wrap-style:square;mso-left-percent:-10001;mso-top-percent:-10001;mso-position-horizontal:absolute;mso-position-horizontal-relative:char;mso-position-vertical:absolute;mso-position-vertical-relative:line;mso-left-percent:-10001;mso-top-percent:-10001;v-text-anchor:top" o:gfxdata="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" filled="f" stroked="f">
+                <o:lock v:ext="edit" aspectratio="t"/>
+                <w10:anchorlock/>
+              </v:rect>
+            </w:pict>
+          </mc:Fallback>
+        </mc:AlternateContent>
+      </w:r>
+      <w:r>
+        <w:rPr>
+          <w:noProof/>
+        </w:rPr>
+        <mc:AlternateContent>
+          <mc:Choice Requires="wps">
+            <w:drawing>
+              <wp:inline distT="0" distB="0" distL="0" distR="0" wp14:anchorId="44E3F803" wp14:editId="26D39BBB">
+                <wp:extent cx="302260" cy="302260"/>
+                <wp:effectExtent l="0" t="0" r="0" b="0"/>
+                <wp:docPr id="290281992" name="Rectángulo 2" descr="Diagrama ER de ventas y empleados"/>
+                <wp:cNvGraphicFramePr>
+                  <a:graphicFrameLocks xmlns:a="http://schemas.openxmlformats.org/drawingml/2006/main" noChangeAspect="1"/>
+                </wp:cNvGraphicFramePr>
+                <a:graphic xmlns:a="http://schemas.openxmlformats.org/drawingml/2006/main">
+                  <a:graphicData uri="http://schemas.microsoft.com/office/word/2010/wordprocessingShape">
+                    <wps:wsp>
+                      <wps:cNvSpPr>
+                        <a:spLocks noChangeAspect="1" noChangeArrowheads="1"/>
+                      </wps:cNvSpPr>
+                      <wps:spPr bwMode="auto">
+                        <a:xfrm>
+                          <a:off x="0" y="0"/>
+                          <a:ext cx="302260" cy="302260"/>
+                        </a:xfrm>
+                        <a:prstGeom prst="rect">
+                          <a:avLst/>
+                        </a:prstGeom>
+                        <a:noFill/>
+                        <a:ln>
+                          <a:noFill/>
+                        </a:ln>
+                        <a:extLst>
+                          <a:ext uri="{909E8E84-426E-40DD-AFC4-6F175D3DCCD1}">
+                            <a14:hiddenFill xmlns:a14="http://schemas.microsoft.com/office/drawing/2010/main">
+                              <a:solidFill>
+                                <a:srgbClr val="FFFFFF"/>
+                              </a:solidFill>
+                            </a14:hiddenFill>
+                          </a:ext>
+                          <a:ext uri="{91240B29-F687-4F45-9708-019B960494DF}">
+                            <a14:hiddenLine xmlns:a14="http://schemas.microsoft.com/office/drawing/2010/main" w="9525">
+                              <a:solidFill>
+                                <a:srgbClr val="000000"/>
+                              </a:solidFill>
+                              <a:miter lim="800000"/>
+                              <a:headEnd/>
+                              <a:tailEnd/>
+                            </a14:hiddenLine>
+                          </a:ext>
+                        </a:extLst>
+                      </wps:spPr>
+                      <wps:bodyPr rot="0" vert="horz" wrap="square" lIns="91440" tIns="45720" rIns="91440" bIns="45720" anchor="t" anchorCtr="0" upright="1">
+                        <a:noAutofit/>
+                      </wps:bodyPr>
+                    </wps:wsp>
+                  </a:graphicData>
+                </a:graphic>
+              </wp:inline>
+            </w:drawing>
+          </mc:Choice>
+          <mc:Fallback>
+            <w:pict>
+              <v:rect w14:anchorId="5E0F950E" id="Rectángulo 2" o:spid="_x0000_s1026" alt="Diagrama ER de ventas y empleados" style="width:23.8pt;height:23.8pt;visibility:visible;mso-wrap-style:square;mso-left-percent:-10001;mso-top-percent:-10001;mso-position-horizontal:absolute;mso-position-horizontal-relative:char;mso-position-vertical:absolute;mso-position-vertical-relative:line;mso-left-percent:-10001;mso-top-percent:-10001;v-text-anchor:top" o:gfxdata="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" filled="f" stroked="f">
+                <o:lock v:ext="edit" aspectratio="t"/>
+                <w10:anchorlock/>
+              </v:rect>
+            </w:pict>
+          </mc:Fallback>
+        </mc:AlternateContent>
+      </w:r>
+      <w:r>
+        <w:rPr>
+          <w:noProof/>
+        </w:rPr>
+        <mc:AlternateContent>
+          <mc:Choice Requires="wps">
+            <w:drawing>
+              <wp:inline distT="0" distB="0" distL="0" distR="0" wp14:anchorId="2226C781" wp14:editId="0F84217F">
+                <wp:extent cx="302260" cy="302260"/>
+                <wp:effectExtent l="0" t="0" r="0" b="0"/>
+                <wp:docPr id="1687451812" name="Rectángulo 3" descr="Diagrama ER de ventas y empleados"/>
+                <wp:cNvGraphicFramePr>
+                  <a:graphicFrameLocks xmlns:a="http://schemas.openxmlformats.org/drawingml/2006/main" noChangeAspect="1"/>
+                </wp:cNvGraphicFramePr>
+                <a:graphic xmlns:a="http://schemas.openxmlformats.org/drawingml/2006/main">
+                  <a:graphicData uri="http://schemas.microsoft.com/office/word/2010/wordprocessingShape">
+                    <wps:wsp>
+                      <wps:cNvSpPr>
+                        <a:spLocks noChangeAspect="1" noChangeArrowheads="1"/>
+                      </wps:cNvSpPr>
+                      <wps:spPr bwMode="auto">
+                        <a:xfrm>
+                          <a:off x="0" y="0"/>
+                          <a:ext cx="302260" cy="302260"/>
+                        </a:xfrm>
+                        <a:prstGeom prst="rect">
+                          <a:avLst/>
+                        </a:prstGeom>
+                        <a:noFill/>
+                        <a:ln>
+                          <a:noFill/>
+                        </a:ln>
+                        <a:extLst>
+                          <a:ext uri="{909E8E84-426E-40DD-AFC4-6F175D3DCCD1}">
+                            <a14:hiddenFill xmlns:a14="http://schemas.microsoft.com/office/drawing/2010/main">
+                              <a:solidFill>
+                                <a:srgbClr val="FFFFFF"/>
+                              </a:solidFill>
+                            </a14:hiddenFill>
+                          </a:ext>
+                          <a:ext uri="{91240B29-F687-4F45-9708-019B960494DF}">
+                            <a14:hiddenLine xmlns:a14="http://schemas.microsoft.com/office/drawing/2010/main" w="9525">
+                              <a:solidFill>
+                                <a:srgbClr val="000000"/>
+                              </a:solidFill>
+                              <a:miter lim="800000"/>
+                              <a:headEnd/>
+                              <a:tailEnd/>
+                            </a14:hiddenLine>
+                          </a:ext>
+                        </a:extLst>
+                      </wps:spPr>
+                      <wps:bodyPr rot="0" vert="horz" wrap="square" lIns="91440" tIns="45720" rIns="91440" bIns="45720" anchor="t" anchorCtr="0" upright="1">
+                        <a:noAutofit/>
+                      </wps:bodyPr>
+                    </wps:wsp>
+                  </a:graphicData>
+                </a:graphic>
+              </wp:inline>
+            </w:drawing>
+          </mc:Choice>
+          <mc:Fallback>
+            <w:pict>
+              <v:rect w14:anchorId="65D67971" id="Rectángulo 3" o:spid="_x0000_s1026" alt="Diagrama ER de ventas y empleados" style="width:23.8pt;height:23.8pt;visibility:visible;mso-wrap-style:square;mso-left-percent:-10001;mso-top-percent:-10001;mso-position-horizontal:absolute;mso-position-horizontal-relative:char;mso-position-vertical:absolute;mso-position-vertical-relative:line;mso-left-percent:-10001;mso-top-percent:-10001;v-text-anchor:top" o:gfxdata="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" filled="f" stroked="f">
+                <o:lock v:ext="edit" aspectratio="t"/>
+                <w10:anchorlock/>
+              </v:rect>
+            </w:pict>
+          </mc:Fallback>
+        </mc:AlternateContent>
+      </w:r>
+      <w:r>
+        <w:t xml:space="preserve"> </w:t>
+      </w:r>
+      <w:r>
+        <w:rPr>
+          <w:noProof/>
+        </w:rPr>
+        <mc:AlternateContent>
+          <mc:Choice Requires="wps">
+            <w:drawing>
+              <wp:inline distT="0" distB="0" distL="0" distR="0" wp14:anchorId="770B0E8B" wp14:editId="64ECC971">
+                <wp:extent cx="302260" cy="302260"/>
+                <wp:effectExtent l="0" t="0" r="0" b="0"/>
+                <wp:docPr id="1844690046" name="Rectángulo 5" descr="Diagrama ER de ventas y empleados"/>
+                <wp:cNvGraphicFramePr>
+                  <a:graphicFrameLocks xmlns:a="http://schemas.openxmlformats.org/drawingml/2006/main" noChangeAspect="1"/>
+                </wp:cNvGraphicFramePr>
+                <a:graphic xmlns:a="http://schemas.openxmlformats.org/drawingml/2006/main">
+                  <a:graphicData uri="http://schemas.microsoft.com/office/word/2010/wordprocessingShape">
+                    <wps:wsp>
+                      <wps:cNvSpPr>
+                        <a:spLocks noChangeAspect="1" noChangeArrowheads="1"/>
+                      </wps:cNvSpPr>
+                      <wps:spPr bwMode="auto">
+                        <a:xfrm>
+                          <a:off x="0" y="0"/>
+                          <a:ext cx="302260" cy="302260"/>
+                        </a:xfrm>
+                        <a:prstGeom prst="rect">
+                          <a:avLst/>
+                        </a:prstGeom>
+                        <a:noFill/>
+                        <a:ln>
+                          <a:noFill/>
+                        </a:ln>
+                        <a:extLst>
+                          <a:ext uri="{909E8E84-426E-40DD-AFC4-6F175D3DCCD1}">
+                            <a14:hiddenFill xmlns:a14="http://schemas.microsoft.com/office/drawing/2010/main">
+                              <a:solidFill>
+                                <a:srgbClr val="FFFFFF"/>
+                              </a:solidFill>
+                            </a14:hiddenFill>
+                          </a:ext>
+                          <a:ext uri="{91240B29-F687-4F45-9708-019B960494DF}">
+                            <a14:hiddenLine xmlns:a14="http://schemas.microsoft.com/office/drawing/2010/main" w="9525">
+                              <a:solidFill>
+                                <a:srgbClr val="000000"/>
+                              </a:solidFill>
+                              <a:miter lim="800000"/>
+                              <a:headEnd/>
+                              <a:tailEnd/>
+                            </a14:hiddenLine>
+                          </a:ext>
+                        </a:extLst>
+                      </wps:spPr>
+                      <wps:bodyPr rot="0" vert="horz" wrap="square" lIns="91440" tIns="45720" rIns="91440" bIns="45720" anchor="t" anchorCtr="0" upright="1">
+                        <a:noAutofit/>
+                      </wps:bodyPr>
+                    </wps:wsp>
+                  </a:graphicData>
+                </a:graphic>
+              </wp:inline>
+            </w:drawing>
+          </mc:Choice>
+          <mc:Fallback>
+            <w:pict>
+              <v:rect w14:anchorId="7C9C145A" id="Rectángulo 5" o:spid="_x0000_s1026" alt="Diagrama ER de ventas y empleados" style="width:23.8pt;height:23.8pt;visibility:visible;mso-wrap-style:square;mso-left-percent:-10001;mso-top-percent:-10001;mso-position-horizontal:absolute;mso-position-horizontal-relative:char;mso-position-vertical:absolute;mso-position-vertical-relative:line;mso-left-percent:-10001;mso-top-percent:-10001;v-text-anchor:top" o:gfxdata="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" filled="f" stroked="f">
+                <o:lock v:ext="edit" aspectratio="t"/>
+                <w10:anchorlock/>
+              </v:rect>
+            </w:pict>
+          </mc:Fallback>
+        </mc:AlternateContent>
+      </w:r>
+      <w:r>
+        <w:rPr>
+          <w:noProof/>
+        </w:rPr>
+        <w:drawing>
+          <wp:inline distT="0" distB="0" distL="0" distR="0" wp14:anchorId="5B55C93D" wp14:editId="652BC8FB">
+            <wp:extent cx="5398770" cy="3442970"/>
+            <wp:effectExtent l="0" t="0" r="0" b="5080"/>
+            <wp:docPr id="1115188235" name="Imagen 6"/>
+            <wp:cNvGraphicFramePr>
+              <a:graphicFrameLocks xmlns:a="http://schemas.openxmlformats.org/drawingml/2006/main" noChangeAspect="1"/>
+            </wp:cNvGraphicFramePr>
+            <a:graphic xmlns:a="http://schemas.openxmlformats.org/drawingml/2006/main">
+              <a:graphicData uri="http://schemas.openxmlformats.org/drawingml/2006/picture">
+                <pic:pic xmlns:pic="http://schemas.openxmlformats.org/drawingml/2006/picture">
+                  <pic:nvPicPr>
+                    <pic:cNvPr id="0" name="Picture 10"/>
+                    <pic:cNvPicPr>
+                      <a:picLocks noChangeAspect="1" noChangeArrowheads="1"/>
+                    </pic:cNvPicPr>
+                  </pic:nvPicPr>
+                  <pic:blipFill>
+                    <a:blip r:embed="rId8" cstate="print">
+                      <a:extLst>
+                        <a:ext uri="{28A0092B-C50C-407E-A947-70E740481C1C}">
+                          <a14:useLocalDpi xmlns:a14="http://schemas.microsoft.com/office/drawing/2010/main" val="0"/>
+                        </a:ext>
+                      </a:extLst>
+                    </a:blip>
+                    <a:srcRect/>
+                    <a:stretch>
+                      <a:fillRect/>
+                    </a:stretch>
+                  </pic:blipFill>
+                  <pic:spPr bwMode="auto">
+                    <a:xfrm>
+                      <a:off x="0" y="0"/>
+                      <a:ext cx="5398770" cy="3442970"/>
+                    </a:xfrm>
+                    <a:prstGeom prst="rect">
+                      <a:avLst/>
+                    </a:prstGeom>
+                    <a:noFill/>
+                    <a:ln>
+                      <a:noFill/>
+                    </a:ln>
+                  </pic:spPr>
+                </pic:pic>
+              </a:graphicData>
+            </a:graphic>
+          </wp:inline>
+        </w:drawing>
+      </w:r>
+    </w:p>
+    <w:p>
+      <w:pPr>
+        <w:jc w:val="center"/>
+      </w:pPr>
+    </w:p>
+    <w:p>
+      <w:pPr>
+        <w:jc w:val="center"/>
+      </w:pPr>
+    </w:p>
+    <w:p>
+      <w:pPr>
+        <w:jc w:val="center"/>
+        <w:rPr>
+          <w:b/>
+          <w:bCs/>
+          <w:sz w:val="28"/>
+          <w:szCs w:val="28"/>
+        </w:rPr>
+      </w:pPr>
+    </w:p>
     <w:sectPr>
+      <w:footerReference w:type="default" r:id="rId9"/>
       <w:pgSz w:w="11906" w:h="16838"/>
       <w:pgMar w:top="1417" w:right="1701" w:bottom="1417" w:left="1701" w:header="708" w:footer="708" w:gutter="0"/>
       <w:cols w:space="708"/>
@@ -1158,6 +1696,122 @@
     </w:sectPr>
   </w:body>
 </w:document>
+</file>
+
+<file path=word/endnotes.xml><?xml version="1.0" encoding="utf-8"?>
+<w:endnotes xmlns:wpc="http://schemas.microsoft.com/office/word/2010/wordprocessingCanvas" xmlns:cx="http://schemas.microsoft.com/office/drawing/2014/chartex" xmlns:cx1="http://schemas.microsoft.com/office/drawing/2015/9/8/chartex" xmlns:cx2="http://schemas.microsoft.com/office/drawing/2015/10/21/chartex" xmlns:cx3="http://schemas.microsoft.com/office/drawing/2016/5/9/chartex" xmlns:cx4="http://schemas.microsoft.com/office/drawing/2016/5/10/chartex" xmlns:cx5="http://schemas.microsoft.com/office/drawing/2016/5/11/chartex" xmlns:cx6="http://schemas.microsoft.com/office/drawing/2016/5/12/chartex" xmlns:cx7="http://schemas.microsoft.com/office/drawing/2016/5/13/chartex" xmlns:cx8="http://schemas.microsoft.com/office/drawing/2016/5/14/chartex" xmlns:mc="http://schemas.openxmlformats.org/markup-compatibility/2006" xmlns:aink="http://schemas.microsoft.com/office/drawing/2016/ink" xmlns:am3d="http://schemas.microsoft.com/office/drawing/2017/model3d" xmlns:o="urn:schemas-microsoft-com:office:office" xmlns:oel="http://schemas.microsoft.com/office/2019/extlst" xmlns:r="http://schemas.openxmlformats.org/officeDocument/2006/relationships" xmlns:m="http://schemas.openxmlformats.org/officeDocument/2006/math" xmlns:v="urn:schemas-microsoft-com:vml" xmlns:wp14="http://schemas.microsoft.com/office/word/2010/wordprocessingDrawing" xmlns:wp="http://schemas.openxmlformats.org/drawingml/2006/wordprocessingDrawing" xmlns:w10="urn:schemas-microsoft-com:office:word" xmlns:w="http://schemas.openxmlformats.org/wordprocessingml/2006/main" xmlns:w14="http://schemas.microsoft.com/office/word/2010/wordml" xmlns:w15="http://schemas.microsoft.com/office/word/2012/wordml" xmlns:w16cex="http://schemas.microsoft.com/office/word/2018/wordml/cex" xmlns:w16cid="http://schemas.microsoft.com/office/word/2016/wordml/cid" xmlns:w16="http://schemas.microsoft.com/office/word/2018/wordml" xmlns:w16du="http://schemas.microsoft.com/office/word/2023/wordml/word16du" xmlns:w16sdtdh="http://schemas.microsoft.com/office/word/2020/wordml/sdtdatahash" xmlns:w16sdtfl="http://schemas.microsoft.com/office/word/2024/wordml/sdtformatlock" xmlns:w16se="http://schemas.microsoft.com/office/word/2015/wordml/symex" xmlns:wpg="http://schemas.microsoft.com/office/word/2010/wordprocessingGroup" xmlns:wpi="http://schemas.microsoft.com/office/word/2010/wordprocessingInk" xmlns:wne="http://schemas.microsoft.com/office/word/2006/wordml" xmlns:wps="http://schemas.microsoft.com/office/word/2010/wordprocessingShape" mc:Ignorable="w14 w15 w16se w16cid w16 w16cex w16sdtdh w16sdtfl w16du wp14">
+  <w:endnote w:type="separator" w:id="-1">
+    <w:p>
+      <w:pPr>
+        <w:spacing w:after="0" w:line="240" w:lineRule="auto"/>
+      </w:pPr>
+      <w:r>
+        <w:separator/>
+      </w:r>
+    </w:p>
+  </w:endnote>
+  <w:endnote w:type="continuationSeparator" w:id="0">
+    <w:p>
+      <w:pPr>
+        <w:spacing w:after="0" w:line="240" w:lineRule="auto"/>
+      </w:pPr>
+      <w:r>
+        <w:continuationSeparator/>
+      </w:r>
+    </w:p>
+  </w:endnote>
+</w:endnotes>
+</file>
+
+<file path=word/footer1.xml><?xml version="1.0" encoding="utf-8"?>
+<w:ftr xmlns:wpc="http://schemas.microsoft.com/office/word/2010/wordprocessingCanvas" xmlns:cx="http://schemas.microsoft.com/office/drawing/2014/chartex" xmlns:cx1="http://schemas.microsoft.com/office/drawing/2015/9/8/chartex" xmlns:cx2="http://schemas.microsoft.com/office/drawing/2015/10/21/chartex" xmlns:cx3="http://schemas.microsoft.com/office/drawing/2016/5/9/chartex" xmlns:cx4="http://schemas.microsoft.com/office/drawing/2016/5/10/chartex" xmlns:cx5="http://schemas.microsoft.com/office/drawing/2016/5/11/chartex" xmlns:cx6="http://schemas.microsoft.com/office/drawing/2016/5/12/chartex" xmlns:cx7="http://schemas.microsoft.com/office/drawing/2016/5/13/chartex" xmlns:cx8="http://schemas.microsoft.com/office/drawing/2016/5/14/chartex" xmlns:mc="http://schemas.openxmlformats.org/markup-compatibility/2006" xmlns:aink="http://schemas.microsoft.com/office/drawing/2016/ink" xmlns:am3d="http://schemas.microsoft.com/office/drawing/2017/model3d" xmlns:o="urn:schemas-microsoft-com:office:office" xmlns:oel="http://schemas.microsoft.com/office/2019/extlst" xmlns:r="http://schemas.openxmlformats.org/officeDocument/2006/relationships" xmlns:m="http://schemas.openxmlformats.org/officeDocument/2006/math" xmlns:v="urn:schemas-microsoft-com:vml" xmlns:wp14="http://schemas.microsoft.com/office/word/2010/wordprocessingDrawing" xmlns:wp="http://schemas.openxmlformats.org/drawingml/2006/wordprocessingDrawing" xmlns:w10="urn:schemas-microsoft-com:office:word" xmlns:w="http://schemas.openxmlformats.org/wordprocessingml/2006/main" xmlns:w14="http://schemas.microsoft.com/office/word/2010/wordml" xmlns:w15="http://schemas.microsoft.com/office/word/2012/wordml" xmlns:w16cex="http://schemas.microsoft.com/office/word/2018/wordml/cex" xmlns:w16cid="http://schemas.microsoft.com/office/word/2016/wordml/cid" xmlns:w16="http://schemas.microsoft.com/office/word/2018/wordml" xmlns:w16du="http://schemas.microsoft.com/office/word/2023/wordml/word16du" xmlns:w16sdtdh="http://schemas.microsoft.com/office/word/2020/wordml/sdtdatahash" xmlns:w16sdtfl="http://schemas.microsoft.com/office/word/2024/wordml/sdtformatlock" xmlns:w16se="http://schemas.microsoft.com/office/word/2015/wordml/symex" xmlns:wpg="http://schemas.microsoft.com/office/word/2010/wordprocessingGroup" xmlns:wpi="http://schemas.microsoft.com/office/word/2010/wordprocessingInk" xmlns:wne="http://schemas.microsoft.com/office/word/2006/wordml" xmlns:wps="http://schemas.microsoft.com/office/word/2010/wordprocessingShape" mc:Ignorable="w14 w15 w16se w16cid w16 w16cex w16sdtdh w16sdtfl w16du wp14">
+  <w:p>
+    <w:pPr>
+      <w:pStyle w:val="Piedepgina"/>
+      <w:jc w:val="center"/>
+      <w:rPr>
+        <w:caps/>
+        <w:color w:val="156082" w:themeColor="accent1"/>
+      </w:rPr>
+    </w:pPr>
+  </w:p>
+  <w:p>
+    <w:pPr>
+      <w:pStyle w:val="Piedepgina"/>
+      <w:jc w:val="center"/>
+      <w:rPr>
+        <w:caps/>
+        <w:color w:val="156082" w:themeColor="accent1"/>
+      </w:rPr>
+    </w:pPr>
+    <w:r>
+      <w:rPr>
+        <w:caps/>
+        <w:color w:val="156082" w:themeColor="accent1"/>
+      </w:rPr>
+      <w:fldChar w:fldCharType="begin"/>
+    </w:r>
+    <w:r>
+      <w:rPr>
+        <w:caps/>
+        <w:color w:val="156082" w:themeColor="accent1"/>
+      </w:rPr>
+      <w:instrText>PAGE   \* MERGEFORMAT</w:instrText>
+    </w:r>
+    <w:r>
+      <w:rPr>
+        <w:caps/>
+        <w:color w:val="156082" w:themeColor="accent1"/>
+      </w:rPr>
+      <w:fldChar w:fldCharType="separate"/>
+    </w:r>
+    <w:r>
+      <w:rPr>
+        <w:caps/>
+        <w:color w:val="156082" w:themeColor="accent1"/>
+        <w:lang w:val="es-MX"/>
+      </w:rPr>
+      <w:t>2</w:t>
+    </w:r>
+    <w:r>
+      <w:rPr>
+        <w:caps/>
+        <w:color w:val="156082" w:themeColor="accent1"/>
+      </w:rPr>
+      <w:fldChar w:fldCharType="end"/>
+    </w:r>
+  </w:p>
+  <w:p>
+    <w:pPr>
+      <w:pStyle w:val="Piedepgina"/>
+    </w:pPr>
+  </w:p>
+</w:ftr>
+</file>
+
+<file path=word/footnotes.xml><?xml version="1.0" encoding="utf-8"?>
+<w:footnotes xmlns:wpc="http://schemas.microsoft.com/office/word/2010/wordprocessingCanvas" xmlns:cx="http://schemas.microsoft.com/office/drawing/2014/chartex" xmlns:cx1="http://schemas.microsoft.com/office/drawing/2015/9/8/chartex" xmlns:cx2="http://schemas.microsoft.com/office/drawing/2015/10/21/chartex" xmlns:cx3="http://schemas.microsoft.com/office/drawing/2016/5/9/chartex" xmlns:cx4="http://schemas.microsoft.com/office/drawing/2016/5/10/chartex" xmlns:cx5="http://schemas.microsoft.com/office/drawing/2016/5/11/chartex" xmlns:cx6="http://schemas.microsoft.com/office/drawing/2016/5/12/chartex" xmlns:cx7="http://schemas.microsoft.com/office/drawing/2016/5/13/chartex" xmlns:cx8="http://schemas.microsoft.com/office/drawing/2016/5/14/chartex" xmlns:mc="http://schemas.openxmlformats.org/markup-compatibility/2006" xmlns:aink="http://schemas.microsoft.com/office/drawing/2016/ink" xmlns:am3d="http://schemas.microsoft.com/office/drawing/2017/model3d" xmlns:o="urn:schemas-microsoft-com:office:office" xmlns:oel="http://schemas.microsoft.com/office/2019/extlst" xmlns:r="http://schemas.openxmlformats.org/officeDocument/2006/relationships" xmlns:m="http://schemas.openxmlformats.org/officeDocument/2006/math" xmlns:v="urn:schemas-microsoft-com:vml" xmlns:wp14="http://schemas.microsoft.com/office/word/2010/wordprocessingDrawing" xmlns:wp="http://schemas.openxmlformats.org/drawingml/2006/wordprocessingDrawing" xmlns:w10="urn:schemas-microsoft-com:office:word" xmlns:w="http://schemas.openxmlformats.org/wordprocessingml/2006/main" xmlns:w14="http://schemas.microsoft.com/office/word/2010/wordml" xmlns:w15="http://schemas.microsoft.com/office/word/2012/wordml" xmlns:w16cex="http://schemas.microsoft.com/office/word/2018/wordml/cex" xmlns:w16cid="http://schemas.microsoft.com/office/word/2016/wordml/cid" xmlns:w16="http://schemas.microsoft.com/office/word/2018/wordml" xmlns:w16du="http://schemas.microsoft.com/office/word/2023/wordml/word16du" xmlns:w16sdtdh="http://schemas.microsoft.com/office/word/2020/wordml/sdtdatahash" xmlns:w16sdtfl="http://schemas.microsoft.com/office/word/2024/wordml/sdtformatlock" xmlns:w16se="http://schemas.microsoft.com/office/word/2015/wordml/symex" xmlns:wpg="http://schemas.microsoft.com/office/word/2010/wordprocessingGroup" xmlns:wpi="http://schemas.microsoft.com/office/word/2010/wordprocessingInk" xmlns:wne="http://schemas.microsoft.com/office/word/2006/wordml" xmlns:wps="http://schemas.microsoft.com/office/word/2010/wordprocessingShape" mc:Ignorable="w14 w15 w16se w16cid w16 w16cex w16sdtdh w16sdtfl w16du wp14">
+  <w:footnote w:type="separator" w:id="-1">
+    <w:p>
+      <w:pPr>
+        <w:spacing w:after="0" w:line="240" w:lineRule="auto"/>
+      </w:pPr>
+      <w:r>
+        <w:separator/>
+      </w:r>
+    </w:p>
+  </w:footnote>
+  <w:footnote w:type="continuationSeparator" w:id="0">
+    <w:p>
+      <w:pPr>
+        <w:spacing w:after="0" w:line="240" w:lineRule="auto"/>
+      </w:pPr>
+      <w:r>
+        <w:continuationSeparator/>
+      </w:r>
+    </w:p>
+  </w:footnote>
+</w:footnotes>
 </file>
 
 <file path=word/styles.xml><?xml version="1.0" encoding="utf-8"?>
@@ -2075,6 +2729,50 @@
       <w:spacing w:val="5"/>
     </w:rPr>
   </w:style>
+  <w:style w:type="paragraph" w:styleId="Encabezado">
+    <w:name w:val="header"/>
+    <w:basedOn w:val="Normal"/>
+    <w:link w:val="EncabezadoCar"/>
+    <w:uiPriority w:val="99"/>
+    <w:unhideWhenUsed/>
+    <w:rsid w:val="00823D75"/>
+    <w:pPr>
+      <w:tabs>
+        <w:tab w:val="center" w:pos="4252"/>
+        <w:tab w:val="right" w:pos="8504"/>
+      </w:tabs>
+      <w:spacing w:after="0" w:line="240" w:lineRule="auto"/>
+    </w:pPr>
+  </w:style>
+  <w:style w:type="character" w:customStyle="1" w:styleId="EncabezadoCar">
+    <w:name w:val="Encabezado Car"/>
+    <w:basedOn w:val="Fuentedeprrafopredeter"/>
+    <w:link w:val="Encabezado"/>
+    <w:uiPriority w:val="99"/>
+    <w:rsid w:val="00823D75"/>
+  </w:style>
+  <w:style w:type="paragraph" w:styleId="Piedepgina">
+    <w:name w:val="footer"/>
+    <w:basedOn w:val="Normal"/>
+    <w:link w:val="PiedepginaCar"/>
+    <w:uiPriority w:val="99"/>
+    <w:unhideWhenUsed/>
+    <w:rsid w:val="00823D75"/>
+    <w:pPr>
+      <w:tabs>
+        <w:tab w:val="center" w:pos="4252"/>
+        <w:tab w:val="right" w:pos="8504"/>
+      </w:tabs>
+      <w:spacing w:after="0" w:line="240" w:lineRule="auto"/>
+    </w:pPr>
+  </w:style>
+  <w:style w:type="character" w:customStyle="1" w:styleId="PiedepginaCar">
+    <w:name w:val="Pie de página Car"/>
+    <w:basedOn w:val="Fuentedeprrafopredeter"/>
+    <w:link w:val="Piedepgina"/>
+    <w:uiPriority w:val="99"/>
+    <w:rsid w:val="00823D75"/>
+  </w:style>
 </w:styles>
 </file>
 

</xml_diff>

<commit_message>
Actualizando documentacion(diagrama de secuencia)
</commit_message>
<xml_diff>
--- a/Proyecto_LCS.docx
+++ b/Proyecto_LCS.docx
@@ -401,7 +401,23 @@
         <w:t>El</w:t>
       </w:r>
       <w:r>
-        <w:t xml:space="preserve"> solicitante del sistema serian los dueños de la barbería y  los usuario final serian los barberos y los destinatarios final  serian los clientes.</w:t>
+        <w:t xml:space="preserve"> solicitante del sistema serian los dueños de la barbería </w:t>
+      </w:r>
+      <w:proofErr w:type="gramStart"/>
+      <w:r>
+        <w:t>y  los</w:t>
+      </w:r>
+      <w:proofErr w:type="gramEnd"/>
+      <w:r>
+        <w:t xml:space="preserve"> usuario final serian los barberos y los destinatarios </w:t>
+      </w:r>
+      <w:proofErr w:type="gramStart"/>
+      <w:r>
+        <w:t>final  serian</w:t>
+      </w:r>
+      <w:proofErr w:type="gramEnd"/>
+      <w:r>
+        <w:t xml:space="preserve"> los clientes.</w:t>
       </w:r>
     </w:p>
     <w:p>
@@ -1674,6 +1690,66 @@
     <w:p>
       <w:pPr>
         <w:jc w:val="center"/>
+        <w:rPr>
+          <w:rFonts w:ascii="Bahnschrift SemiBold Condensed" w:hAnsi="Bahnschrift SemiBold Condensed"/>
+          <w:b/>
+          <w:bCs/>
+          <w:sz w:val="56"/>
+          <w:szCs w:val="56"/>
+          <w:u w:val="single"/>
+        </w:rPr>
+      </w:pPr>
+      <w:r>
+        <w:rPr>
+          <w:rFonts w:ascii="Bahnschrift SemiBold Condensed" w:hAnsi="Bahnschrift SemiBold Condensed"/>
+          <w:b/>
+          <w:bCs/>
+          <w:sz w:val="56"/>
+          <w:szCs w:val="56"/>
+          <w:u w:val="single"/>
+        </w:rPr>
+        <w:lastRenderedPageBreak/>
+        <w:t>Diagramas de secuencias</w:t>
+      </w:r>
+      <w:r>
+        <w:rPr>
+          <w:rFonts w:ascii="Bahnschrift SemiBold Condensed" w:hAnsi="Bahnschrift SemiBold Condensed"/>
+          <w:b/>
+          <w:bCs/>
+          <w:sz w:val="56"/>
+          <w:szCs w:val="56"/>
+          <w:u w:val="single"/>
+        </w:rPr>
+        <w:t xml:space="preserve"> del de la página web</w:t>
+      </w:r>
+    </w:p>
+    <w:p>
+      <w:pPr>
+        <w:jc w:val="center"/>
+        <w:rPr>
+          <w:rFonts w:ascii="Bahnschrift SemiBold Condensed" w:hAnsi="Bahnschrift SemiBold Condensed"/>
+          <w:b/>
+          <w:bCs/>
+          <w:color w:val="EE0000"/>
+          <w:sz w:val="44"/>
+          <w:szCs w:val="44"/>
+        </w:rPr>
+      </w:pPr>
+      <w:r>
+        <w:rPr>
+          <w:rFonts w:ascii="Bahnschrift SemiBold Condensed" w:hAnsi="Bahnschrift SemiBold Condensed"/>
+          <w:b/>
+          <w:bCs/>
+          <w:color w:val="EE0000"/>
+          <w:sz w:val="44"/>
+          <w:szCs w:val="44"/>
+        </w:rPr>
+        <w:t>Solicitar un turno:</w:t>
+      </w:r>
+    </w:p>
+    <w:p>
+      <w:pPr>
+        <w:jc w:val="center"/>
       </w:pPr>
     </w:p>
     <w:p>
@@ -1686,9 +1762,77 @@
           <w:szCs w:val="28"/>
         </w:rPr>
       </w:pPr>
+      <w:r>
+        <w:rPr>
+          <w:b/>
+          <w:bCs/>
+          <w:noProof/>
+          <w:sz w:val="28"/>
+          <w:szCs w:val="28"/>
+        </w:rPr>
+        <w:drawing>
+          <wp:inline distT="0" distB="0" distL="0" distR="0" wp14:anchorId="2ECDF544" wp14:editId="5D1DE58C">
+            <wp:extent cx="5072933" cy="6569120"/>
+            <wp:effectExtent l="0" t="0" r="0" b="3175"/>
+            <wp:docPr id="720764672" name="Imagen 5"/>
+            <wp:cNvGraphicFramePr>
+              <a:graphicFrameLocks xmlns:a="http://schemas.openxmlformats.org/drawingml/2006/main" noChangeAspect="1"/>
+            </wp:cNvGraphicFramePr>
+            <a:graphic xmlns:a="http://schemas.openxmlformats.org/drawingml/2006/main">
+              <a:graphicData uri="http://schemas.openxmlformats.org/drawingml/2006/picture">
+                <pic:pic xmlns:pic="http://schemas.openxmlformats.org/drawingml/2006/picture">
+                  <pic:nvPicPr>
+                    <pic:cNvPr id="0" name="Picture 1"/>
+                    <pic:cNvPicPr>
+                      <a:picLocks noChangeAspect="1" noChangeArrowheads="1"/>
+                    </pic:cNvPicPr>
+                  </pic:nvPicPr>
+                  <pic:blipFill>
+                    <a:blip r:embed="rId9">
+                      <a:extLst>
+                        <a:ext uri="{28A0092B-C50C-407E-A947-70E740481C1C}">
+                          <a14:useLocalDpi xmlns:a14="http://schemas.microsoft.com/office/drawing/2010/main" val="0"/>
+                        </a:ext>
+                      </a:extLst>
+                    </a:blip>
+                    <a:srcRect/>
+                    <a:stretch>
+                      <a:fillRect/>
+                    </a:stretch>
+                  </pic:blipFill>
+                  <pic:spPr bwMode="auto">
+                    <a:xfrm>
+                      <a:off x="0" y="0"/>
+                      <a:ext cx="5074984" cy="6571776"/>
+                    </a:xfrm>
+                    <a:prstGeom prst="rect">
+                      <a:avLst/>
+                    </a:prstGeom>
+                    <a:noFill/>
+                    <a:ln>
+                      <a:noFill/>
+                    </a:ln>
+                  </pic:spPr>
+                </pic:pic>
+              </a:graphicData>
+            </a:graphic>
+          </wp:inline>
+        </w:drawing>
+      </w:r>
+    </w:p>
+    <w:p>
+      <w:pPr>
+        <w:jc w:val="center"/>
+        <w:rPr>
+          <w:b/>
+          <w:bCs/>
+          <w:sz w:val="28"/>
+          <w:szCs w:val="28"/>
+        </w:rPr>
+      </w:pPr>
     </w:p>
     <w:sectPr>
-      <w:footerReference w:type="default" r:id="rId9"/>
+      <w:footerReference w:type="default" r:id="rId10"/>
       <w:pgSz w:w="11906" w:h="16838"/>
       <w:pgMar w:top="1417" w:right="1701" w:bottom="1417" w:left="1701" w:header="708" w:footer="708" w:gutter="0"/>
       <w:cols w:space="708"/>

</xml_diff>